<commit_message>
Redistribui os 4 pts entre Relação benefício/custo e Maturidade da estimativa
Nova distribuição da avaliação financeira econômica (3.1): Relação
benefício/custo mantém até 8 pts; Custo de não fazer/custo do projeto
volta a até 5 pts (valor original); Maturidade da estimativa sobe de
até 2 para até 4 pts (tiers 0·2·4). Metade dos 4 pontos liberados pela
remoção de "Orçamento e janela de execução" reforça o critério de valor
financeiro direto, e a outra metade recai sobre o critério tematicamente
mais próximo do que "orçamento" tentava capturar — a confiança no número
de custo. Aplicado no HTML e no memorial de cálculo em Word.

Co-Authored-By: Claude Sonnet 5 <noreply@anthropic.com>
Claude-Session: https://claude.ai/code/session_01GHLrJpsPmKamyBGqXRwMmB
</commit_message>
<xml_diff>
--- a/Memorial_Calculo_Matriz_Priorizacao.docx
+++ b/Memorial_Calculo_Matriz_Priorizacao.docx
@@ -2757,7 +2757,7 @@
               <w:rPr>
                 <w:sz w:val="19"/>
               </w:rPr>
-              <w:t>7</w:t>
+              <w:t>5</w:t>
             </w:r>
           </w:p>
         </w:tc>
@@ -2830,7 +2830,7 @@
               <w:rPr>
                 <w:sz w:val="19"/>
               </w:rPr>
-              <w:t>5</w:t>
+              <w:t>4</w:t>
             </w:r>
           </w:p>
         </w:tc>
@@ -2903,7 +2903,7 @@
               <w:rPr>
                 <w:sz w:val="19"/>
               </w:rPr>
-              <w:t>4</w:t>
+              <w:t>3</w:t>
             </w:r>
           </w:p>
         </w:tc>
@@ -3361,7 +3361,7 @@
               <w:rPr>
                 <w:sz w:val="19"/>
               </w:rPr>
-              <w:t>0, 1, 2</w:t>
+              <w:t>0, 2, 4</w:t>
             </w:r>
           </w:p>
         </w:tc>

</xml_diff>

<commit_message>
Revisa critérios "Barreira crítica" e "Histórico de incidente ou recorrência"
Barreira crítica (Segurança, 30 pts): remove a opção "barreira de
suporte"; renomeia "barreira importante degradada" para "barreira
crítica degradada"; redistribui os pesos entre as 3 opções restantes —
Não se aplica (0) · barreira crítica degradada (4) · barreira crítica
indisponível (8), mantendo o máximo em 8 pts.

Histórico de incidente ou recorrência: troca "near miss/recorrência"
por "ocorrência em outro equipamento do mesmo TAG" (pontos inalterados).

Aplicado no HTML, no slide "1 · Segurança" do PPTX e no memorial de
cálculo em Word.

Co-Authored-By: Claude Sonnet 5 <noreply@anthropic.com>
Claude-Session: https://claude.ai/code/session_01GHLrJpsPmKamyBGqXRwMmB
</commit_message>
<xml_diff>
--- a/Memorial_Calculo_Matriz_Priorizacao.docx
+++ b/Memorial_Calculo_Matriz_Priorizacao.docx
@@ -1300,7 +1300,7 @@
               <w:rPr>
                 <w:sz w:val="19"/>
               </w:rPr>
-              <w:t>Não se aplica; barreira de suporte; barreira importante degradada; barreira crítica indisponível</w:t>
+              <w:t>Não se aplica; barreira crítica degradada; barreira crítica indisponível</w:t>
             </w:r>
           </w:p>
         </w:tc>
@@ -1324,7 +1324,7 @@
               <w:rPr>
                 <w:sz w:val="19"/>
               </w:rPr>
-              <w:t>0, 3, 5, 8</w:t>
+              <w:t>0, 4, 8</w:t>
             </w:r>
           </w:p>
         </w:tc>
@@ -1372,7 +1372,7 @@
               <w:rPr>
                 <w:sz w:val="19"/>
               </w:rPr>
-              <w:t>Sem registro; desvio isolado; near miss/recorrência; incidente com ação aberta</w:t>
+              <w:t>Sem registro; desvio isolado; ocorrência em outro equipamento do mesmo TAG; incidente com ação aberta</w:t>
             </w:r>
           </w:p>
         </w:tc>

</xml_diff>

<commit_message>
Adiciona Trava de Produção ao memorial e ao PPTX
Memorial: nova seção "Trava de Produção" (acionada ao selecionar
"Incremento de produção" em "Este escopo representa"), seguindo o
padrão das travas de Segurança e Regulatória; atualiza o resumo e a
tabela de Classificação Final para citar as 3 travas; substitui o
campo obsoleto "originador de incremento de produção? (informativo)"
pela descrição real do modo de cálculo (Perda evitada / Incremento de
Produção) e seu efeito.

PPTX: adiciona terceiro card "Trava de Produção" ao lado de Segurança
e Regulatória no slide "Critérios que compõem a pontuação", com os 3
cards redimensionados para caber lado a lado. Validado (schema OOXML
+ varredura de corrupção) sem problemas.

Co-Authored-By: Claude Sonnet 5 <noreply@anthropic.com>
Claude-Session: https://claude.ai/code/session_01GHLrJpsPmKamyBGqXRwMmB
</commit_message>
<xml_diff>
--- a/Memorial_Calculo_Matriz_Priorizacao.docx
+++ b/Memorial_Calculo_Matriz_Priorizacao.docx
@@ -369,17 +369,14 @@
     <w:p/>
     <w:p>
       <w:r>
-        <w:t xml:space="preserve">A classificação final é definida pela pontuação total, mas pode ser elevada automaticamente para </w:t>
+        <w:t>A classificação final é definida pela pontuação total, mas pode ser elevada automaticamente para P1 - Crítica quando houver trava de Segurança, Regulatório ou Produção.</w:t>
       </w:r>
       <w:r>
         <w:rPr>
           <w:b/>
         </w:rPr>
-        <w:t>P1 - Crítica</w:t>
       </w:r>
-      <w:r>
-        <w:t xml:space="preserve"> quando houver trava de Segurança ou Regulatório.</w:t>
-      </w:r>
+      <w:r/>
     </w:p>
     <w:p>
       <w:pPr>
@@ -476,7 +473,7 @@
               <w:rPr>
                 <w:sz w:val="19"/>
               </w:rPr>
-              <w:t>Trava de Segurança ou Regulatório acionada</w:t>
+              <w:t>Trava de Segurança, Regulatório ou Produção acionada</w:t>
             </w:r>
           </w:p>
         </w:tc>
@@ -1078,6 +1075,136 @@
                 <w:sz w:val="19"/>
               </w:rPr>
               <w:t>7</w:t>
+            </w:r>
+          </w:p>
+        </w:tc>
+      </w:tr>
+    </w:tbl>
+    <w:p>
+      <w:pPr>
+        <w:pStyle w:val="Ttulo3"/>
+      </w:pPr>
+      <w:r>
+        <w:rPr>
+          <w:rFonts w:ascii="Calibri" w:eastAsia="Calibri" w:hAnsi="Calibri"/>
+        </w:rPr>
+        <w:t>Trava de Produção</w:t>
+      </w:r>
+    </w:p>
+    <w:p>
+      <w:r>
+        <w:t>Acionada ao selecionar “Incremento de produção” no campo “Este escopo representa” (bloco Produção de Óleo - GP):</w:t>
+      </w:r>
+    </w:p>
+    <w:tbl>
+      <w:tblPr>
+        <w:tblStyle w:val="Tabelacomgrade"/>
+        <w:tblW w:w="9360" w:type="dxa"/>
+        <w:tblInd w:w="120" w:type="dxa"/>
+        <w:tblLayout w:type="fixed"/>
+        <w:tblLook w:val="04A0" w:firstRow="1" w:lastRow="0" w:firstColumn="1" w:lastColumn="0" w:noHBand="0" w:noVBand="1"/>
+      </w:tblPr>
+      <w:tblGrid>
+        <w:gridCol w:w="4200"/>
+        <w:gridCol w:w="5160"/>
+      </w:tblGrid>
+      <w:tr>
+        <w:tc>
+          <w:tcPr>
+            <w:tcW w:w="4200" w:type="dxa"/>
+            <w:shd w:val="clear" w:color="auto" w:fill="E8EEF5"/>
+            <w:tcMar>
+              <w:top w:w="80" w:type="dxa"/>
+              <w:left w:w="120" w:type="dxa"/>
+              <w:bottom w:w="80" w:type="dxa"/>
+              <w:right w:w="120" w:type="dxa"/>
+            </w:tcMar>
+            <w:vAlign w:val="center"/>
+          </w:tcPr>
+          <w:p>
+            <w:pPr>
+              <w:spacing w:after="0"/>
+            </w:pPr>
+            <w:r>
+              <w:rPr>
+                <w:b/>
+                <w:sz w:val="18"/>
+              </w:rPr>
+              <w:t>Condição</w:t>
+            </w:r>
+          </w:p>
+        </w:tc>
+        <w:tc>
+          <w:tcPr>
+            <w:tcW w:w="5160" w:type="dxa"/>
+            <w:shd w:val="clear" w:color="auto" w:fill="E8EEF5"/>
+            <w:tcMar>
+              <w:top w:w="80" w:type="dxa"/>
+              <w:left w:w="120" w:type="dxa"/>
+              <w:bottom w:w="80" w:type="dxa"/>
+              <w:right w:w="120" w:type="dxa"/>
+            </w:tcMar>
+            <w:vAlign w:val="center"/>
+          </w:tcPr>
+          <w:p>
+            <w:pPr>
+              <w:spacing w:after="0"/>
+            </w:pPr>
+            <w:r>
+              <w:rPr>
+                <w:b/>
+                <w:sz w:val="18"/>
+              </w:rPr>
+              <w:t>Pontuação do campo</w:t>
+            </w:r>
+          </w:p>
+        </w:tc>
+      </w:tr>
+      <w:tr>
+        <w:tc>
+          <w:tcPr>
+            <w:tcW w:w="4200" w:type="dxa"/>
+            <w:tcMar>
+              <w:top w:w="80" w:type="dxa"/>
+              <w:left w:w="120" w:type="dxa"/>
+              <w:bottom w:w="80" w:type="dxa"/>
+              <w:right w:w="120" w:type="dxa"/>
+            </w:tcMar>
+            <w:vAlign w:val="center"/>
+          </w:tcPr>
+          <w:p>
+            <w:pPr>
+              <w:spacing w:after="0"/>
+            </w:pPr>
+            <w:r>
+              <w:rPr>
+                <w:sz w:val="19"/>
+              </w:rPr>
+              <w:t>Escopo representa Incremento de Produção (ganho de óleo novo)</w:t>
+            </w:r>
+          </w:p>
+        </w:tc>
+        <w:tc>
+          <w:tcPr>
+            <w:tcW w:w="5160" w:type="dxa"/>
+            <w:tcMar>
+              <w:top w:w="80" w:type="dxa"/>
+              <w:left w:w="120" w:type="dxa"/>
+              <w:bottom w:w="80" w:type="dxa"/>
+              <w:right w:w="120" w:type="dxa"/>
+            </w:tcMar>
+            <w:vAlign w:val="center"/>
+          </w:tcPr>
+          <w:p>
+            <w:pPr>
+              <w:spacing w:after="0"/>
+              <w:jc w:val="center"/>
+            </w:pPr>
+            <w:r>
+              <w:rPr>
+                <w:sz w:val="19"/>
+              </w:rPr>
+              <w:t>P1 automático</w:t>
             </w:r>
           </w:p>
         </w:tc>
@@ -3918,7 +4045,7 @@
     </w:p>
     <w:p>
       <w:r>
-        <w:t>Campo adicional da Gestão da Produção:</w:t>
+        <w:t>Modo de cálculo (Gestão da Produção):</w:t>
       </w:r>
     </w:p>
     <w:tbl>
@@ -4031,7 +4158,7 @@
               <w:rPr>
                 <w:sz w:val="19"/>
               </w:rPr>
-              <w:t>Esse escopo é originador de incremento de produção?</w:t>
+              <w:t>Este escopo representa</w:t>
             </w:r>
           </w:p>
         </w:tc>
@@ -4054,7 +4181,7 @@
               <w:rPr>
                 <w:sz w:val="19"/>
               </w:rPr>
-              <w:t>Sim / Não</w:t>
+              <w:t>Perda evitada / Incremento de produção</w:t>
             </w:r>
           </w:p>
         </w:tc>
@@ -4077,7 +4204,7 @@
               <w:rPr>
                 <w:sz w:val="19"/>
               </w:rPr>
-              <w:t>Informativo. Não altera a pontuação da matriz.</w:t>
+              <w:t>Perda evitada usa a calculadora original. Incremento de produção usa a mesma lógica de Relevância e Benefício/Custo, mas aciona a Trava de Produção (ver Travas de Prioridade) e classifica o escopo como P1.</w:t>
             </w:r>
           </w:p>
         </w:tc>

</xml_diff>